<commit_message>
Uploaded "Returns and Portfolio Mathematics"
</commit_message>
<xml_diff>
--- a/01_Foundations/1. Financial_Markets/Financial Market Structure, Asset Classes & Trading Mechanics.docx
+++ b/01_Foundations/1. Financial_Markets/Financial Market Structure, Asset Classes & Trading Mechanics.docx
@@ -116,6 +116,7 @@
     <w:p>
       <w:pPr>
         <w:spacing w:after="120"/>
+        <w:jc w:val="center"/>
       </w:pPr>
       <w:r>
         <w:t>This is the expanded reference edition of the three Level 1 topics that open the curriculum's Financial Markets Foundations track. Each topic keeps its original learning-position summary and then goes substantially deeper: diagrams of how markets and trades actually work, reference tables with real conventions and figures, worked numerical examples with full arithmetic, and charts quantifying scale, cost and risk. Figures without a cited source are illustrative, constructed for teaching purposes and clearly labelled as such.</w:t>
@@ -2783,12 +2784,6 @@
         <w:gridCol w:w="2260"/>
       </w:tblGrid>
       <w:tr>
-        <w:tblPrEx>
-          <w:tblCellMar>
-            <w:top w:w="0" w:type="dxa"/>
-            <w:bottom w:w="0" w:type="dxa"/>
-          </w:tblCellMar>
-        </w:tblPrEx>
         <w:trPr>
           <w:tblHeader/>
         </w:trPr>
@@ -2894,12 +2889,6 @@
         </w:tc>
       </w:tr>
       <w:tr>
-        <w:tblPrEx>
-          <w:tblCellMar>
-            <w:top w:w="0" w:type="dxa"/>
-            <w:bottom w:w="0" w:type="dxa"/>
-          </w:tblCellMar>
-        </w:tblPrEx>
         <w:tc>
           <w:tcPr>
             <w:tcW w:w="1500" w:type="dxa"/>
@@ -2986,12 +2975,6 @@
         </w:tc>
       </w:tr>
       <w:tr>
-        <w:tblPrEx>
-          <w:tblCellMar>
-            <w:top w:w="0" w:type="dxa"/>
-            <w:bottom w:w="0" w:type="dxa"/>
-          </w:tblCellMar>
-        </w:tblPrEx>
         <w:tc>
           <w:tcPr>
             <w:tcW w:w="1500" w:type="dxa"/>
@@ -3082,12 +3065,6 @@
         </w:tc>
       </w:tr>
       <w:tr>
-        <w:tblPrEx>
-          <w:tblCellMar>
-            <w:top w:w="0" w:type="dxa"/>
-            <w:bottom w:w="0" w:type="dxa"/>
-          </w:tblCellMar>
-        </w:tblPrEx>
         <w:tc>
           <w:tcPr>
             <w:tcW w:w="1500" w:type="dxa"/>
@@ -3174,12 +3151,6 @@
         </w:tc>
       </w:tr>
       <w:tr>
-        <w:tblPrEx>
-          <w:tblCellMar>
-            <w:top w:w="0" w:type="dxa"/>
-            <w:bottom w:w="0" w:type="dxa"/>
-          </w:tblCellMar>
-        </w:tblPrEx>
         <w:tc>
           <w:tcPr>
             <w:tcW w:w="1500" w:type="dxa"/>
@@ -3270,12 +3241,6 @@
         </w:tc>
       </w:tr>
       <w:tr>
-        <w:tblPrEx>
-          <w:tblCellMar>
-            <w:top w:w="0" w:type="dxa"/>
-            <w:bottom w:w="0" w:type="dxa"/>
-          </w:tblCellMar>
-        </w:tblPrEx>
         <w:tc>
           <w:tcPr>
             <w:tcW w:w="1500" w:type="dxa"/>
@@ -3362,12 +3327,6 @@
         </w:tc>
       </w:tr>
       <w:tr>
-        <w:tblPrEx>
-          <w:tblCellMar>
-            <w:top w:w="0" w:type="dxa"/>
-            <w:bottom w:w="0" w:type="dxa"/>
-          </w:tblCellMar>
-        </w:tblPrEx>
         <w:tc>
           <w:tcPr>
             <w:tcW w:w="1500" w:type="dxa"/>
@@ -3458,12 +3417,6 @@
         </w:tc>
       </w:tr>
       <w:tr>
-        <w:tblPrEx>
-          <w:tblCellMar>
-            <w:top w:w="0" w:type="dxa"/>
-            <w:bottom w:w="0" w:type="dxa"/>
-          </w:tblCellMar>
-        </w:tblPrEx>
         <w:tc>
           <w:tcPr>
             <w:tcW w:w="1500" w:type="dxa"/>
@@ -3694,23 +3647,7 @@
           <w:sz w:val="20"/>
           <w:szCs w:val="20"/>
         </w:rPr>
-        <w:t xml:space="preserve">The broker routes the order to </w:t>
-      </w:r>
-      <w:proofErr w:type="spellStart"/>
-      <w:r>
-        <w:rPr>
-          <w:sz w:val="20"/>
-          <w:szCs w:val="20"/>
-        </w:rPr>
-        <w:t>a venue</w:t>
-      </w:r>
-      <w:proofErr w:type="spellEnd"/>
-      <w:r>
-        <w:rPr>
-          <w:sz w:val="20"/>
-          <w:szCs w:val="20"/>
-        </w:rPr>
-        <w:t xml:space="preserve"> (its own exchange, an ATS, or an internal matching engine), where it either rests on the book or matches against existing liquidity.</w:t>
+        <w:t>The broker routes the order to a venue (its own exchange, an ATS, or an internal matching engine), where it either rests on the book or matches against existing liquidity.</w:t>
       </w:r>
     </w:p>
     <w:p>
@@ -4293,12 +4230,6 @@
         <w:gridCol w:w="2680"/>
       </w:tblGrid>
       <w:tr>
-        <w:tblPrEx>
-          <w:tblCellMar>
-            <w:top w:w="0" w:type="dxa"/>
-            <w:bottom w:w="0" w:type="dxa"/>
-          </w:tblCellMar>
-        </w:tblPrEx>
         <w:trPr>
           <w:tblHeader/>
         </w:trPr>
@@ -4404,12 +4335,6 @@
         </w:tc>
       </w:tr>
       <w:tr>
-        <w:tblPrEx>
-          <w:tblCellMar>
-            <w:top w:w="0" w:type="dxa"/>
-            <w:bottom w:w="0" w:type="dxa"/>
-          </w:tblCellMar>
-        </w:tblPrEx>
         <w:tc>
           <w:tcPr>
             <w:tcW w:w="1500" w:type="dxa"/>
@@ -4496,12 +4421,6 @@
         </w:tc>
       </w:tr>
       <w:tr>
-        <w:tblPrEx>
-          <w:tblCellMar>
-            <w:top w:w="0" w:type="dxa"/>
-            <w:bottom w:w="0" w:type="dxa"/>
-          </w:tblCellMar>
-        </w:tblPrEx>
         <w:tc>
           <w:tcPr>
             <w:tcW w:w="1500" w:type="dxa"/>
@@ -4592,12 +4511,6 @@
         </w:tc>
       </w:tr>
       <w:tr>
-        <w:tblPrEx>
-          <w:tblCellMar>
-            <w:top w:w="0" w:type="dxa"/>
-            <w:bottom w:w="0" w:type="dxa"/>
-          </w:tblCellMar>
-        </w:tblPrEx>
         <w:tc>
           <w:tcPr>
             <w:tcW w:w="1500" w:type="dxa"/>
@@ -4684,12 +4597,6 @@
         </w:tc>
       </w:tr>
       <w:tr>
-        <w:tblPrEx>
-          <w:tblCellMar>
-            <w:top w:w="0" w:type="dxa"/>
-            <w:bottom w:w="0" w:type="dxa"/>
-          </w:tblCellMar>
-        </w:tblPrEx>
         <w:tc>
           <w:tcPr>
             <w:tcW w:w="1500" w:type="dxa"/>
@@ -4780,12 +4687,6 @@
         </w:tc>
       </w:tr>
       <w:tr>
-        <w:tblPrEx>
-          <w:tblCellMar>
-            <w:top w:w="0" w:type="dxa"/>
-            <w:bottom w:w="0" w:type="dxa"/>
-          </w:tblCellMar>
-        </w:tblPrEx>
         <w:tc>
           <w:tcPr>
             <w:tcW w:w="1500" w:type="dxa"/>
@@ -4872,12 +4773,6 @@
         </w:tc>
       </w:tr>
       <w:tr>
-        <w:tblPrEx>
-          <w:tblCellMar>
-            <w:top w:w="0" w:type="dxa"/>
-            <w:bottom w:w="0" w:type="dxa"/>
-          </w:tblCellMar>
-        </w:tblPrEx>
         <w:tc>
           <w:tcPr>
             <w:tcW w:w="1500" w:type="dxa"/>
@@ -4968,12 +4863,6 @@
         </w:tc>
       </w:tr>
       <w:tr>
-        <w:tblPrEx>
-          <w:tblCellMar>
-            <w:top w:w="0" w:type="dxa"/>
-            <w:bottom w:w="0" w:type="dxa"/>
-          </w:tblCellMar>
-        </w:tblPrEx>
         <w:tc>
           <w:tcPr>
             <w:tcW w:w="1500" w:type="dxa"/>
@@ -5129,29 +5018,7 @@
           <w:sz w:val="20"/>
           <w:szCs w:val="20"/>
         </w:rPr>
-        <w:t xml:space="preserve">⚠  Case study: </w:t>
-      </w:r>
-      <w:proofErr w:type="spellStart"/>
-      <w:r>
-        <w:rPr>
-          <w:b/>
-          <w:bCs/>
-          <w:color w:val="C0392B"/>
-          <w:sz w:val="20"/>
-          <w:szCs w:val="20"/>
-        </w:rPr>
-        <w:t>Herstatt</w:t>
-      </w:r>
-      <w:proofErr w:type="spellEnd"/>
-      <w:r>
-        <w:rPr>
-          <w:b/>
-          <w:bCs/>
-          <w:color w:val="C0392B"/>
-          <w:sz w:val="20"/>
-          <w:szCs w:val="20"/>
-        </w:rPr>
-        <w:t xml:space="preserve"> risk</w:t>
+        <w:t>⚠  Case study: Herstatt risk</w:t>
       </w:r>
     </w:p>
     <w:p>
@@ -5172,23 +5039,7 @@
           <w:sz w:val="20"/>
           <w:szCs w:val="20"/>
         </w:rPr>
-        <w:t xml:space="preserve">In 1974, Germany's </w:t>
-      </w:r>
-      <w:proofErr w:type="spellStart"/>
-      <w:r>
-        <w:rPr>
-          <w:sz w:val="20"/>
-          <w:szCs w:val="20"/>
-        </w:rPr>
-        <w:t>Herstatt</w:t>
-      </w:r>
-      <w:proofErr w:type="spellEnd"/>
-      <w:r>
-        <w:rPr>
-          <w:sz w:val="20"/>
-          <w:szCs w:val="20"/>
-        </w:rPr>
-        <w:t xml:space="preserve"> Bank was closed by regulators mid-day — after it had received Deutschmark payments from FX counterparties but before it had made the corresponding US-dollar payments in New York (due to time-zone settlement gaps). Counterparties lost the dollar leg entirely.</w:t>
+        <w:t>In 1974, Germany's Herstatt Bank was closed by regulators mid-day — after it had received Deutschmark payments from FX counterparties but before it had made the corresponding US-dollar payments in New York (due to time-zone settlement gaps). Counterparties lost the dollar leg entirely.</w:t>
       </w:r>
     </w:p>
     <w:p>
@@ -5209,23 +5060,7 @@
           <w:sz w:val="20"/>
           <w:szCs w:val="20"/>
         </w:rPr>
-        <w:t>This is the origin of the term “</w:t>
-      </w:r>
-      <w:proofErr w:type="spellStart"/>
-      <w:r>
-        <w:rPr>
-          <w:sz w:val="20"/>
-          <w:szCs w:val="20"/>
-        </w:rPr>
-        <w:t>Herstatt</w:t>
-      </w:r>
-      <w:proofErr w:type="spellEnd"/>
-      <w:r>
-        <w:rPr>
-          <w:sz w:val="20"/>
-          <w:szCs w:val="20"/>
-        </w:rPr>
-        <w:t xml:space="preserve"> risk” — settlement risk arising from the time lag between when one side of a trade is paid and when the other side is paid — and it directly motivated the creation of CLS Bank, which today settles the majority of global FX trades on a payment-versus-payment (PvP) basis specifically to eliminate this gap.</w:t>
+        <w:t>This is the origin of the term “Herstatt risk” — settlement risk arising from the time lag between when one side of a trade is paid and when the other side is paid — and it directly motivated the creation of CLS Bank, which today settles the majority of global FX trades on a payment-versus-payment (PvP) basis specifically to eliminate this gap.</w:t>
       </w:r>
     </w:p>
     <w:p>
@@ -5692,12 +5527,6 @@
         <w:gridCol w:w="2660"/>
       </w:tblGrid>
       <w:tr>
-        <w:tblPrEx>
-          <w:tblCellMar>
-            <w:top w:w="0" w:type="dxa"/>
-            <w:bottom w:w="0" w:type="dxa"/>
-          </w:tblCellMar>
-        </w:tblPrEx>
         <w:trPr>
           <w:tblHeader/>
         </w:trPr>
@@ -5803,12 +5632,6 @@
         </w:tc>
       </w:tr>
       <w:tr>
-        <w:tblPrEx>
-          <w:tblCellMar>
-            <w:top w:w="0" w:type="dxa"/>
-            <w:bottom w:w="0" w:type="dxa"/>
-          </w:tblCellMar>
-        </w:tblPrEx>
         <w:tc>
           <w:tcPr>
             <w:tcW w:w="1600" w:type="dxa"/>
@@ -5895,12 +5718,6 @@
         </w:tc>
       </w:tr>
       <w:tr>
-        <w:tblPrEx>
-          <w:tblCellMar>
-            <w:top w:w="0" w:type="dxa"/>
-            <w:bottom w:w="0" w:type="dxa"/>
-          </w:tblCellMar>
-        </w:tblPrEx>
         <w:tc>
           <w:tcPr>
             <w:tcW w:w="1600" w:type="dxa"/>
@@ -5991,12 +5808,6 @@
         </w:tc>
       </w:tr>
       <w:tr>
-        <w:tblPrEx>
-          <w:tblCellMar>
-            <w:top w:w="0" w:type="dxa"/>
-            <w:bottom w:w="0" w:type="dxa"/>
-          </w:tblCellMar>
-        </w:tblPrEx>
         <w:tc>
           <w:tcPr>
             <w:tcW w:w="1600" w:type="dxa"/>
@@ -6083,12 +5894,6 @@
         </w:tc>
       </w:tr>
       <w:tr>
-        <w:tblPrEx>
-          <w:tblCellMar>
-            <w:top w:w="0" w:type="dxa"/>
-            <w:bottom w:w="0" w:type="dxa"/>
-          </w:tblCellMar>
-        </w:tblPrEx>
         <w:tc>
           <w:tcPr>
             <w:tcW w:w="1600" w:type="dxa"/>
@@ -6179,12 +5984,6 @@
         </w:tc>
       </w:tr>
       <w:tr>
-        <w:tblPrEx>
-          <w:tblCellMar>
-            <w:top w:w="0" w:type="dxa"/>
-            <w:bottom w:w="0" w:type="dxa"/>
-          </w:tblCellMar>
-        </w:tblPrEx>
         <w:tc>
           <w:tcPr>
             <w:tcW w:w="1600" w:type="dxa"/>
@@ -6271,12 +6070,6 @@
         </w:tc>
       </w:tr>
       <w:tr>
-        <w:tblPrEx>
-          <w:tblCellMar>
-            <w:top w:w="0" w:type="dxa"/>
-            <w:bottom w:w="0" w:type="dxa"/>
-          </w:tblCellMar>
-        </w:tblPrEx>
         <w:tc>
           <w:tcPr>
             <w:tcW w:w="1600" w:type="dxa"/>
@@ -6368,12 +6161,6 @@
         </w:tc>
       </w:tr>
       <w:tr>
-        <w:tblPrEx>
-          <w:tblCellMar>
-            <w:top w:w="0" w:type="dxa"/>
-            <w:bottom w:w="0" w:type="dxa"/>
-          </w:tblCellMar>
-        </w:tblPrEx>
         <w:tc>
           <w:tcPr>
             <w:tcW w:w="1600" w:type="dxa"/>
@@ -6460,12 +6247,6 @@
         </w:tc>
       </w:tr>
       <w:tr>
-        <w:tblPrEx>
-          <w:tblCellMar>
-            <w:top w:w="0" w:type="dxa"/>
-            <w:bottom w:w="0" w:type="dxa"/>
-          </w:tblCellMar>
-        </w:tblPrEx>
         <w:tc>
           <w:tcPr>
             <w:tcW w:w="1600" w:type="dxa"/>
@@ -6556,12 +6337,6 @@
         </w:tc>
       </w:tr>
       <w:tr>
-        <w:tblPrEx>
-          <w:tblCellMar>
-            <w:top w:w="0" w:type="dxa"/>
-            <w:bottom w:w="0" w:type="dxa"/>
-          </w:tblCellMar>
-        </w:tblPrEx>
         <w:tc>
           <w:tcPr>
             <w:tcW w:w="1600" w:type="dxa"/>
@@ -6648,12 +6423,6 @@
         </w:tc>
       </w:tr>
       <w:tr>
-        <w:tblPrEx>
-          <w:tblCellMar>
-            <w:top w:w="0" w:type="dxa"/>
-            <w:bottom w:w="0" w:type="dxa"/>
-          </w:tblCellMar>
-        </w:tblPrEx>
         <w:tc>
           <w:tcPr>
             <w:tcW w:w="1600" w:type="dxa"/>
@@ -6744,12 +6513,6 @@
         </w:tc>
       </w:tr>
       <w:tr>
-        <w:tblPrEx>
-          <w:tblCellMar>
-            <w:top w:w="0" w:type="dxa"/>
-            <w:bottom w:w="0" w:type="dxa"/>
-          </w:tblCellMar>
-        </w:tblPrEx>
         <w:tc>
           <w:tcPr>
             <w:tcW w:w="1600" w:type="dxa"/>
@@ -6836,12 +6599,6 @@
         </w:tc>
       </w:tr>
       <w:tr>
-        <w:tblPrEx>
-          <w:tblCellMar>
-            <w:top w:w="0" w:type="dxa"/>
-            <w:bottom w:w="0" w:type="dxa"/>
-          </w:tblCellMar>
-        </w:tblPrEx>
         <w:tc>
           <w:tcPr>
             <w:tcW w:w="1600" w:type="dxa"/>
@@ -6981,12 +6738,6 @@
         <w:gridCol w:w="2000"/>
       </w:tblGrid>
       <w:tr>
-        <w:tblPrEx>
-          <w:tblCellMar>
-            <w:top w:w="0" w:type="dxa"/>
-            <w:bottom w:w="0" w:type="dxa"/>
-          </w:tblCellMar>
-        </w:tblPrEx>
         <w:trPr>
           <w:tblHeader/>
         </w:trPr>
@@ -7117,12 +6868,6 @@
         </w:tc>
       </w:tr>
       <w:tr>
-        <w:tblPrEx>
-          <w:tblCellMar>
-            <w:top w:w="0" w:type="dxa"/>
-            <w:bottom w:w="0" w:type="dxa"/>
-          </w:tblCellMar>
-        </w:tblPrEx>
         <w:tc>
           <w:tcPr>
             <w:tcW w:w="2100" w:type="dxa"/>
@@ -7230,12 +6975,6 @@
         </w:tc>
       </w:tr>
       <w:tr>
-        <w:tblPrEx>
-          <w:tblCellMar>
-            <w:top w:w="0" w:type="dxa"/>
-            <w:bottom w:w="0" w:type="dxa"/>
-          </w:tblCellMar>
-        </w:tblPrEx>
         <w:tc>
           <w:tcPr>
             <w:tcW w:w="2100" w:type="dxa"/>
@@ -7348,12 +7087,6 @@
         </w:tc>
       </w:tr>
       <w:tr>
-        <w:tblPrEx>
-          <w:tblCellMar>
-            <w:top w:w="0" w:type="dxa"/>
-            <w:bottom w:w="0" w:type="dxa"/>
-          </w:tblCellMar>
-        </w:tblPrEx>
         <w:tc>
           <w:tcPr>
             <w:tcW w:w="2100" w:type="dxa"/>
@@ -7461,12 +7194,6 @@
         </w:tc>
       </w:tr>
       <w:tr>
-        <w:tblPrEx>
-          <w:tblCellMar>
-            <w:top w:w="0" w:type="dxa"/>
-            <w:bottom w:w="0" w:type="dxa"/>
-          </w:tblCellMar>
-        </w:tblPrEx>
         <w:tc>
           <w:tcPr>
             <w:tcW w:w="2100" w:type="dxa"/>
@@ -7579,12 +7306,6 @@
         </w:tc>
       </w:tr>
       <w:tr>
-        <w:tblPrEx>
-          <w:tblCellMar>
-            <w:top w:w="0" w:type="dxa"/>
-            <w:bottom w:w="0" w:type="dxa"/>
-          </w:tblCellMar>
-        </w:tblPrEx>
         <w:tc>
           <w:tcPr>
             <w:tcW w:w="2100" w:type="dxa"/>
@@ -7692,12 +7413,6 @@
         </w:tc>
       </w:tr>
       <w:tr>
-        <w:tblPrEx>
-          <w:tblCellMar>
-            <w:top w:w="0" w:type="dxa"/>
-            <w:bottom w:w="0" w:type="dxa"/>
-          </w:tblCellMar>
-        </w:tblPrEx>
         <w:tc>
           <w:tcPr>
             <w:tcW w:w="2100" w:type="dxa"/>
@@ -7811,12 +7526,6 @@
         </w:tc>
       </w:tr>
       <w:tr>
-        <w:tblPrEx>
-          <w:tblCellMar>
-            <w:top w:w="0" w:type="dxa"/>
-            <w:bottom w:w="0" w:type="dxa"/>
-          </w:tblCellMar>
-        </w:tblPrEx>
         <w:tc>
           <w:tcPr>
             <w:tcW w:w="2100" w:type="dxa"/>
@@ -7924,12 +7633,6 @@
         </w:tc>
       </w:tr>
       <w:tr>
-        <w:tblPrEx>
-          <w:tblCellMar>
-            <w:top w:w="0" w:type="dxa"/>
-            <w:bottom w:w="0" w:type="dxa"/>
-          </w:tblCellMar>
-        </w:tblPrEx>
         <w:tc>
           <w:tcPr>
             <w:tcW w:w="2100" w:type="dxa"/>
@@ -8042,12 +7745,6 @@
         </w:tc>
       </w:tr>
       <w:tr>
-        <w:tblPrEx>
-          <w:tblCellMar>
-            <w:top w:w="0" w:type="dxa"/>
-            <w:bottom w:w="0" w:type="dxa"/>
-          </w:tblCellMar>
-        </w:tblPrEx>
         <w:tc>
           <w:tcPr>
             <w:tcW w:w="2100" w:type="dxa"/>
@@ -8155,12 +7852,6 @@
         </w:tc>
       </w:tr>
       <w:tr>
-        <w:tblPrEx>
-          <w:tblCellMar>
-            <w:top w:w="0" w:type="dxa"/>
-            <w:bottom w:w="0" w:type="dxa"/>
-          </w:tblCellMar>
-        </w:tblPrEx>
         <w:tc>
           <w:tcPr>
             <w:tcW w:w="2100" w:type="dxa"/>
@@ -8315,12 +8006,6 @@
         <w:gridCol w:w="3060"/>
       </w:tblGrid>
       <w:tr>
-        <w:tblPrEx>
-          <w:tblCellMar>
-            <w:top w:w="0" w:type="dxa"/>
-            <w:bottom w:w="0" w:type="dxa"/>
-          </w:tblCellMar>
-        </w:tblPrEx>
         <w:trPr>
           <w:tblHeader/>
         </w:trPr>
@@ -8401,12 +8086,6 @@
         </w:tc>
       </w:tr>
       <w:tr>
-        <w:tblPrEx>
-          <w:tblCellMar>
-            <w:top w:w="0" w:type="dxa"/>
-            <w:bottom w:w="0" w:type="dxa"/>
-          </w:tblCellMar>
-        </w:tblPrEx>
         <w:tc>
           <w:tcPr>
             <w:tcW w:w="2600" w:type="dxa"/>
@@ -8472,12 +8151,6 @@
         </w:tc>
       </w:tr>
       <w:tr>
-        <w:tblPrEx>
-          <w:tblCellMar>
-            <w:top w:w="0" w:type="dxa"/>
-            <w:bottom w:w="0" w:type="dxa"/>
-          </w:tblCellMar>
-        </w:tblPrEx>
         <w:tc>
           <w:tcPr>
             <w:tcW w:w="2600" w:type="dxa"/>
@@ -8546,12 +8219,6 @@
         </w:tc>
       </w:tr>
       <w:tr>
-        <w:tblPrEx>
-          <w:tblCellMar>
-            <w:top w:w="0" w:type="dxa"/>
-            <w:bottom w:w="0" w:type="dxa"/>
-          </w:tblCellMar>
-        </w:tblPrEx>
         <w:tc>
           <w:tcPr>
             <w:tcW w:w="2600" w:type="dxa"/>
@@ -8617,12 +8284,6 @@
         </w:tc>
       </w:tr>
       <w:tr>
-        <w:tblPrEx>
-          <w:tblCellMar>
-            <w:top w:w="0" w:type="dxa"/>
-            <w:bottom w:w="0" w:type="dxa"/>
-          </w:tblCellMar>
-        </w:tblPrEx>
         <w:tc>
           <w:tcPr>
             <w:tcW w:w="2600" w:type="dxa"/>
@@ -8691,12 +8352,6 @@
         </w:tc>
       </w:tr>
       <w:tr>
-        <w:tblPrEx>
-          <w:tblCellMar>
-            <w:top w:w="0" w:type="dxa"/>
-            <w:bottom w:w="0" w:type="dxa"/>
-          </w:tblCellMar>
-        </w:tblPrEx>
         <w:tc>
           <w:tcPr>
             <w:tcW w:w="2600" w:type="dxa"/>
@@ -8762,12 +8417,6 @@
         </w:tc>
       </w:tr>
       <w:tr>
-        <w:tblPrEx>
-          <w:tblCellMar>
-            <w:top w:w="0" w:type="dxa"/>
-            <w:bottom w:w="0" w:type="dxa"/>
-          </w:tblCellMar>
-        </w:tblPrEx>
         <w:tc>
           <w:tcPr>
             <w:tcW w:w="2600" w:type="dxa"/>
@@ -9043,23 +8692,7 @@
         <w:spacing w:after="120"/>
       </w:pPr>
       <w:r>
-        <w:t xml:space="preserve">A systematic strategy </w:t>
-      </w:r>
-      <w:proofErr w:type="spellStart"/>
-      <w:r>
-        <w:t>backtested</w:t>
-      </w:r>
-      <w:proofErr w:type="spellEnd"/>
-      <w:r>
-        <w:t xml:space="preserve"> on perpetual futures without deducting funding payments will report an inflated Sharpe ratio — exactly the kind of transaction-cost omission flagged as a critical </w:t>
-      </w:r>
-      <w:proofErr w:type="spellStart"/>
-      <w:r>
-        <w:t>backtesting</w:t>
-      </w:r>
-      <w:proofErr w:type="spellEnd"/>
-      <w:r>
-        <w:t xml:space="preserve"> failure mode in Part III of the main curriculum. Funding is not a rounding error: the worked example above shows it can compound to a double-digit annualised percentage drag.</w:t>
+        <w:t>A systematic strategy backtested on perpetual futures without deducting funding payments will report an inflated Sharpe ratio — exactly the kind of transaction-cost omission flagged as a critical backtesting failure mode in Part III of the main curriculum. Funding is not a rounding error: the worked example above shows it can compound to a double-digit annualised percentage drag.</w:t>
       </w:r>
     </w:p>
     <w:p>
@@ -9122,23 +8755,7 @@
           <w:sz w:val="20"/>
           <w:szCs w:val="20"/>
         </w:rPr>
-        <w:t xml:space="preserve">Enterprise risk systems must correctly map each asset class's specific risk factors (duration and credit spread for bonds, beta and idiosyncratic risk for equities, interest-rate differentials for FX) into a common factor-risk framework to produce a single, coherent portfolio </w:t>
-      </w:r>
-      <w:proofErr w:type="spellStart"/>
-      <w:r>
-        <w:rPr>
-          <w:sz w:val="20"/>
-          <w:szCs w:val="20"/>
-        </w:rPr>
-        <w:t>VaR</w:t>
-      </w:r>
-      <w:proofErr w:type="spellEnd"/>
-      <w:r>
-        <w:rPr>
-          <w:sz w:val="20"/>
-          <w:szCs w:val="20"/>
-        </w:rPr>
-        <w:t xml:space="preserve"> or stress-test number.</w:t>
+        <w:t>Enterprise risk systems must correctly map each asset class's specific risk factors (duration and credit spread for bonds, beta and idiosyncratic risk for equities, interest-rate differentials for FX) into a common factor-risk framework to produce a single, coherent portfolio VaR or stress-test number.</w:t>
       </w:r>
     </w:p>
     <w:p>
@@ -9237,23 +8854,7 @@
           <w:sz w:val="20"/>
           <w:szCs w:val="20"/>
         </w:rPr>
-        <w:t xml:space="preserve">Every risk metric, </w:t>
-      </w:r>
-      <w:proofErr w:type="spellStart"/>
-      <w:r>
-        <w:rPr>
-          <w:sz w:val="20"/>
-          <w:szCs w:val="20"/>
-        </w:rPr>
-        <w:t>backtest</w:t>
-      </w:r>
-      <w:proofErr w:type="spellEnd"/>
-      <w:r>
-        <w:rPr>
-          <w:sz w:val="20"/>
-          <w:szCs w:val="20"/>
-        </w:rPr>
-        <w:t xml:space="preserve"> and trading conversation is expressed in this vocabulary; ambiguity here compounds into every later error.</w:t>
+        <w:t>Every risk metric, backtest and trading conversation is expressed in this vocabulary; ambiguity here compounds into every later error.</w:t>
       </w:r>
     </w:p>
     <w:p>
@@ -9305,23 +8906,7 @@
           <w:sz w:val="20"/>
           <w:szCs w:val="20"/>
         </w:rPr>
-        <w:t xml:space="preserve">P&amp;L and slippage definitions must match exactly what the </w:t>
-      </w:r>
-      <w:proofErr w:type="spellStart"/>
-      <w:r>
-        <w:rPr>
-          <w:sz w:val="20"/>
-          <w:szCs w:val="20"/>
-        </w:rPr>
-        <w:t>backtest</w:t>
-      </w:r>
-      <w:proofErr w:type="spellEnd"/>
-      <w:r>
-        <w:rPr>
-          <w:sz w:val="20"/>
-          <w:szCs w:val="20"/>
-        </w:rPr>
-        <w:t xml:space="preserve"> measures, or research results won't be reproducible in production.</w:t>
+        <w:t>P&amp;L and slippage definitions must match exactly what the backtest measures, or research results won't be reproducible in production.</w:t>
       </w:r>
     </w:p>
     <w:p>
@@ -9347,23 +8932,7 @@
           <w:sz w:val="20"/>
           <w:szCs w:val="20"/>
         </w:rPr>
-        <w:t xml:space="preserve">Position-keeping and mark-to-market logic is core plumbing in any trading or </w:t>
-      </w:r>
-      <w:proofErr w:type="spellStart"/>
-      <w:r>
-        <w:rPr>
-          <w:sz w:val="20"/>
-          <w:szCs w:val="20"/>
-        </w:rPr>
-        <w:t>backtesting</w:t>
-      </w:r>
-      <w:proofErr w:type="spellEnd"/>
-      <w:r>
-        <w:rPr>
-          <w:sz w:val="20"/>
-          <w:szCs w:val="20"/>
-        </w:rPr>
-        <w:t xml:space="preserve"> system.</w:t>
+        <w:t>Position-keeping and mark-to-market logic is core plumbing in any trading or backtesting system.</w:t>
       </w:r>
     </w:p>
     <w:p>
@@ -9558,12 +9127,6 @@
         <w:gridCol w:w="1960"/>
       </w:tblGrid>
       <w:tr>
-        <w:tblPrEx>
-          <w:tblCellMar>
-            <w:top w:w="0" w:type="dxa"/>
-            <w:bottom w:w="0" w:type="dxa"/>
-          </w:tblCellMar>
-        </w:tblPrEx>
         <w:trPr>
           <w:tblHeader/>
         </w:trPr>
@@ -9669,12 +9232,6 @@
         </w:tc>
       </w:tr>
       <w:tr>
-        <w:tblPrEx>
-          <w:tblCellMar>
-            <w:top w:w="0" w:type="dxa"/>
-            <w:bottom w:w="0" w:type="dxa"/>
-          </w:tblCellMar>
-        </w:tblPrEx>
         <w:tc>
           <w:tcPr>
             <w:tcW w:w="1550" w:type="dxa"/>
@@ -9761,12 +9318,6 @@
         </w:tc>
       </w:tr>
       <w:tr>
-        <w:tblPrEx>
-          <w:tblCellMar>
-            <w:top w:w="0" w:type="dxa"/>
-            <w:bottom w:w="0" w:type="dxa"/>
-          </w:tblCellMar>
-        </w:tblPrEx>
         <w:tc>
           <w:tcPr>
             <w:tcW w:w="1550" w:type="dxa"/>
@@ -9829,23 +9380,7 @@
                 <w:sz w:val="19"/>
                 <w:szCs w:val="19"/>
               </w:rPr>
-              <w:t>Spread = Ask − Bid.  Mid = (</w:t>
-            </w:r>
-            <w:proofErr w:type="spellStart"/>
-            <w:r>
-              <w:rPr>
-                <w:sz w:val="19"/>
-                <w:szCs w:val="19"/>
-              </w:rPr>
-              <w:t>Bid+Ask</w:t>
-            </w:r>
-            <w:proofErr w:type="spellEnd"/>
-            <w:r>
-              <w:rPr>
-                <w:sz w:val="19"/>
-                <w:szCs w:val="19"/>
-              </w:rPr>
-              <w:t>)/2.</w:t>
+              <w:t>Spread = Ask − Bid.  Mid = (Bid+Ask)/2.</w:t>
             </w:r>
           </w:p>
         </w:tc>
@@ -9873,12 +9408,6 @@
         </w:tc>
       </w:tr>
       <w:tr>
-        <w:tblPrEx>
-          <w:tblCellMar>
-            <w:top w:w="0" w:type="dxa"/>
-            <w:bottom w:w="0" w:type="dxa"/>
-          </w:tblCellMar>
-        </w:tblPrEx>
         <w:tc>
           <w:tcPr>
             <w:tcW w:w="1550" w:type="dxa"/>
@@ -9965,12 +9494,6 @@
         </w:tc>
       </w:tr>
       <w:tr>
-        <w:tblPrEx>
-          <w:tblCellMar>
-            <w:top w:w="0" w:type="dxa"/>
-            <w:bottom w:w="0" w:type="dxa"/>
-          </w:tblCellMar>
-        </w:tblPrEx>
         <w:tc>
           <w:tcPr>
             <w:tcW w:w="1550" w:type="dxa"/>
@@ -10061,12 +9584,6 @@
         </w:tc>
       </w:tr>
       <w:tr>
-        <w:tblPrEx>
-          <w:tblCellMar>
-            <w:top w:w="0" w:type="dxa"/>
-            <w:bottom w:w="0" w:type="dxa"/>
-          </w:tblCellMar>
-        </w:tblPrEx>
         <w:tc>
           <w:tcPr>
             <w:tcW w:w="1550" w:type="dxa"/>
@@ -10153,12 +9670,6 @@
         </w:tc>
       </w:tr>
       <w:tr>
-        <w:tblPrEx>
-          <w:tblCellMar>
-            <w:top w:w="0" w:type="dxa"/>
-            <w:bottom w:w="0" w:type="dxa"/>
-          </w:tblCellMar>
-        </w:tblPrEx>
         <w:tc>
           <w:tcPr>
             <w:tcW w:w="1550" w:type="dxa"/>
@@ -10249,12 +9760,6 @@
         </w:tc>
       </w:tr>
       <w:tr>
-        <w:tblPrEx>
-          <w:tblCellMar>
-            <w:top w:w="0" w:type="dxa"/>
-            <w:bottom w:w="0" w:type="dxa"/>
-          </w:tblCellMar>
-        </w:tblPrEx>
         <w:tc>
           <w:tcPr>
             <w:tcW w:w="1550" w:type="dxa"/>
@@ -10342,12 +9847,6 @@
         </w:tc>
       </w:tr>
       <w:tr>
-        <w:tblPrEx>
-          <w:tblCellMar>
-            <w:top w:w="0" w:type="dxa"/>
-            <w:bottom w:w="0" w:type="dxa"/>
-          </w:tblCellMar>
-        </w:tblPrEx>
         <w:tc>
           <w:tcPr>
             <w:tcW w:w="1550" w:type="dxa"/>
@@ -10432,34 +9931,12 @@
                 <w:sz w:val="19"/>
                 <w:szCs w:val="19"/>
               </w:rPr>
-              <w:t xml:space="preserve">Long 5 ES @ </w:t>
-            </w:r>
-            <w:proofErr w:type="spellStart"/>
-            <w:r>
-              <w:rPr>
-                <w:sz w:val="19"/>
-                <w:szCs w:val="19"/>
-              </w:rPr>
-              <w:t>avg</w:t>
-            </w:r>
-            <w:proofErr w:type="spellEnd"/>
-            <w:r>
-              <w:rPr>
-                <w:sz w:val="19"/>
-                <w:szCs w:val="19"/>
-              </w:rPr>
-              <w:t xml:space="preserve"> 5,002, current price 5,008: Unrealised P&amp;L = (5,008−5,002)×5×$50 = +$1,500.</w:t>
+              <w:t>Long 5 ES @ avg 5,002, current price 5,008: Unrealised P&amp;L = (5,008−5,002)×5×$50 = +$1,500.</w:t>
             </w:r>
           </w:p>
         </w:tc>
       </w:tr>
       <w:tr>
-        <w:tblPrEx>
-          <w:tblCellMar>
-            <w:top w:w="0" w:type="dxa"/>
-            <w:bottom w:w="0" w:type="dxa"/>
-          </w:tblCellMar>
-        </w:tblPrEx>
         <w:tc>
           <w:tcPr>
             <w:tcW w:w="1550" w:type="dxa"/>
@@ -10546,12 +10023,6 @@
         </w:tc>
       </w:tr>
       <w:tr>
-        <w:tblPrEx>
-          <w:tblCellMar>
-            <w:top w:w="0" w:type="dxa"/>
-            <w:bottom w:w="0" w:type="dxa"/>
-          </w:tblCellMar>
-        </w:tblPrEx>
         <w:tc>
           <w:tcPr>
             <w:tcW w:w="1550" w:type="dxa"/>
@@ -10642,12 +10113,6 @@
         </w:tc>
       </w:tr>
       <w:tr>
-        <w:tblPrEx>
-          <w:tblCellMar>
-            <w:top w:w="0" w:type="dxa"/>
-            <w:bottom w:w="0" w:type="dxa"/>
-          </w:tblCellMar>
-        </w:tblPrEx>
         <w:tc>
           <w:tcPr>
             <w:tcW w:w="1550" w:type="dxa"/>
@@ -10734,12 +10199,6 @@
         </w:tc>
       </w:tr>
       <w:tr>
-        <w:tblPrEx>
-          <w:tblCellMar>
-            <w:top w:w="0" w:type="dxa"/>
-            <w:bottom w:w="0" w:type="dxa"/>
-          </w:tblCellMar>
-        </w:tblPrEx>
         <w:tc>
           <w:tcPr>
             <w:tcW w:w="1550" w:type="dxa"/>
@@ -10830,12 +10289,6 @@
         </w:tc>
       </w:tr>
       <w:tr>
-        <w:tblPrEx>
-          <w:tblCellMar>
-            <w:top w:w="0" w:type="dxa"/>
-            <w:bottom w:w="0" w:type="dxa"/>
-          </w:tblCellMar>
-        </w:tblPrEx>
         <w:tc>
           <w:tcPr>
             <w:tcW w:w="1550" w:type="dxa"/>
@@ -10922,12 +10375,6 @@
         </w:tc>
       </w:tr>
       <w:tr>
-        <w:tblPrEx>
-          <w:tblCellMar>
-            <w:top w:w="0" w:type="dxa"/>
-            <w:bottom w:w="0" w:type="dxa"/>
-          </w:tblCellMar>
-        </w:tblPrEx>
         <w:tc>
           <w:tcPr>
             <w:tcW w:w="1550" w:type="dxa"/>
@@ -11064,12 +10511,6 @@
         <w:gridCol w:w="1500"/>
       </w:tblGrid>
       <w:tr>
-        <w:tblPrEx>
-          <w:tblCellMar>
-            <w:top w:w="0" w:type="dxa"/>
-            <w:bottom w:w="0" w:type="dxa"/>
-          </w:tblCellMar>
-        </w:tblPrEx>
         <w:trPr>
           <w:tblHeader/>
         </w:trPr>
@@ -11250,12 +10691,6 @@
         </w:tc>
       </w:tr>
       <w:tr>
-        <w:tblPrEx>
-          <w:tblCellMar>
-            <w:top w:w="0" w:type="dxa"/>
-            <w:bottom w:w="0" w:type="dxa"/>
-          </w:tblCellMar>
-        </w:tblPrEx>
         <w:tc>
           <w:tcPr>
             <w:tcW w:w="1500" w:type="dxa"/>
@@ -11405,12 +10840,6 @@
         </w:tc>
       </w:tr>
       <w:tr>
-        <w:tblPrEx>
-          <w:tblCellMar>
-            <w:top w:w="0" w:type="dxa"/>
-            <w:bottom w:w="0" w:type="dxa"/>
-          </w:tblCellMar>
-        </w:tblPrEx>
         <w:tc>
           <w:tcPr>
             <w:tcW w:w="1500" w:type="dxa"/>
@@ -11567,12 +10996,6 @@
         </w:tc>
       </w:tr>
       <w:tr>
-        <w:tblPrEx>
-          <w:tblCellMar>
-            <w:top w:w="0" w:type="dxa"/>
-            <w:bottom w:w="0" w:type="dxa"/>
-          </w:tblCellMar>
-        </w:tblPrEx>
         <w:tc>
           <w:tcPr>
             <w:tcW w:w="1500" w:type="dxa"/>
@@ -11722,12 +11145,6 @@
         </w:tc>
       </w:tr>
       <w:tr>
-        <w:tblPrEx>
-          <w:tblCellMar>
-            <w:top w:w="0" w:type="dxa"/>
-            <w:bottom w:w="0" w:type="dxa"/>
-          </w:tblCellMar>
-        </w:tblPrEx>
         <w:tc>
           <w:tcPr>
             <w:tcW w:w="1500" w:type="dxa"/>
@@ -12094,12 +11511,6 @@
         <w:gridCol w:w="1560"/>
       </w:tblGrid>
       <w:tr>
-        <w:tblPrEx>
-          <w:tblCellMar>
-            <w:top w:w="0" w:type="dxa"/>
-            <w:bottom w:w="0" w:type="dxa"/>
-          </w:tblCellMar>
-        </w:tblPrEx>
         <w:trPr>
           <w:tblHeader/>
         </w:trPr>
@@ -12231,12 +11642,6 @@
         </w:tc>
       </w:tr>
       <w:tr>
-        <w:tblPrEx>
-          <w:tblCellMar>
-            <w:top w:w="0" w:type="dxa"/>
-            <w:bottom w:w="0" w:type="dxa"/>
-          </w:tblCellMar>
-        </w:tblPrEx>
         <w:tc>
           <w:tcPr>
             <w:tcW w:w="2400" w:type="dxa"/>
@@ -12344,12 +11749,6 @@
         </w:tc>
       </w:tr>
       <w:tr>
-        <w:tblPrEx>
-          <w:tblCellMar>
-            <w:top w:w="0" w:type="dxa"/>
-            <w:bottom w:w="0" w:type="dxa"/>
-          </w:tblCellMar>
-        </w:tblPrEx>
         <w:tc>
           <w:tcPr>
             <w:tcW w:w="2400" w:type="dxa"/>
@@ -12462,12 +11861,6 @@
         </w:tc>
       </w:tr>
       <w:tr>
-        <w:tblPrEx>
-          <w:tblCellMar>
-            <w:top w:w="0" w:type="dxa"/>
-            <w:bottom w:w="0" w:type="dxa"/>
-          </w:tblCellMar>
-        </w:tblPrEx>
         <w:tc>
           <w:tcPr>
             <w:tcW w:w="2400" w:type="dxa"/>
@@ -12575,12 +11968,6 @@
         </w:tc>
       </w:tr>
       <w:tr>
-        <w:tblPrEx>
-          <w:tblCellMar>
-            <w:top w:w="0" w:type="dxa"/>
-            <w:bottom w:w="0" w:type="dxa"/>
-          </w:tblCellMar>
-        </w:tblPrEx>
         <w:tc>
           <w:tcPr>
             <w:tcW w:w="2400" w:type="dxa"/>
@@ -12936,15 +12323,7 @@
         <w:spacing w:after="120"/>
       </w:pPr>
       <w:r>
-        <w:t xml:space="preserve">A theoretical </w:t>
-      </w:r>
-      <w:proofErr w:type="spellStart"/>
-      <w:r>
-        <w:t>backtest</w:t>
-      </w:r>
-      <w:proofErr w:type="spellEnd"/>
-      <w:r>
-        <w:t xml:space="preserve"> that transacts at the mid-price is silently assuming zero transaction cost on every trade — in reality, a market order crosses the spread, paying the ask to buy and receiving the bid to sell.</w:t>
+        <w:t>A theoretical backtest that transacts at the mid-price is silently assuming zero transaction cost on every trade — in reality, a market order crosses the spread, paying the ask to buy and receiving the bid to sell.</w:t>
       </w:r>
     </w:p>
     <w:p>
@@ -13156,23 +12535,7 @@
           <w:sz w:val="20"/>
           <w:szCs w:val="20"/>
         </w:rPr>
-        <w:t xml:space="preserve">On a $100,000 position (2,000 shares), that is $80 lost per round trip with zero net price movement — exactly the cost a mid-price </w:t>
-      </w:r>
-      <w:proofErr w:type="spellStart"/>
-      <w:r>
-        <w:rPr>
-          <w:sz w:val="20"/>
-          <w:szCs w:val="20"/>
-        </w:rPr>
-        <w:t>backtest</w:t>
-      </w:r>
-      <w:proofErr w:type="spellEnd"/>
-      <w:r>
-        <w:rPr>
-          <w:sz w:val="20"/>
-          <w:szCs w:val="20"/>
-        </w:rPr>
-        <w:t xml:space="preserve"> silently ignores.</w:t>
+        <w:t>On a $100,000 position (2,000 shares), that is $80 lost per round trip with zero net price movement — exactly the cost a mid-price backtest silently ignores.</w:t>
       </w:r>
     </w:p>
     <w:p>
@@ -13366,15 +12729,7 @@
         <w:spacing w:after="120"/>
       </w:pPr>
       <w:r>
-        <w:t xml:space="preserve">This is the single most common reason a promising-looking </w:t>
-      </w:r>
-      <w:proofErr w:type="spellStart"/>
-      <w:r>
-        <w:t>backtest</w:t>
-      </w:r>
-      <w:proofErr w:type="spellEnd"/>
-      <w:r>
-        <w:t xml:space="preserve"> fails to replicate live, and it compounds directly with trading frequency, as Figure 3.4 shows. Any P&amp;L or Sharpe ratio computed at the mid-price should be treated as an unrealistic upper bound until spread (and, for larger size, market impact) is explicitly deducted.</w:t>
+        <w:t>This is the single most common reason a promising-looking backtest fails to replicate live, and it compounds directly with trading frequency, as Figure 3.4 shows. Any P&amp;L or Sharpe ratio computed at the mid-price should be treated as an unrealistic upper bound until spread (and, for larger size, market impact) is explicitly deducted.</w:t>
       </w:r>
     </w:p>
     <w:p>

</xml_diff>